<commit_message>
updated fips 201 evaluation program attestation form
</commit_message>
<xml_diff>
--- a/docs/fips201-evaluation-program-attestation-form-for-piv-card-body-approval.docx
+++ b/docs/fips201-evaluation-program-attestation-form-for-piv-card-body-approval.docx
@@ -1004,7 +1004,7 @@
                 <w:rFonts w:ascii="Times New Roman" w:cs="Times New Roman" w:eastAsia="Times New Roman" w:hAnsi="Times New Roman"/>
                 <w:rtl w:val="0"/>
               </w:rPr>
-              <w:t xml:space="preserve">11.0.0</w:t>
+              <w:t xml:space="preserve">11.1.0</w:t>
             </w:r>
           </w:p>
         </w:tc>
@@ -6387,15 +6387,20 @@
         <w:ind w:left="200" w:firstLine="0"/>
         <w:rPr>
           <w:rFonts w:ascii="Times New Roman" w:cs="Times New Roman" w:eastAsia="Times New Roman" w:hAnsi="Times New Roman"/>
-          <w:b w:val="1"/>
+          <w:i w:val="1"/>
           <w:sz w:val="20"/>
           <w:szCs w:val="20"/>
         </w:rPr>
       </w:pPr>
       <w:r>
         <w:rPr>
+          <w:rFonts w:ascii="Times New Roman" w:cs="Times New Roman" w:eastAsia="Times New Roman" w:hAnsi="Times New Roman"/>
+          <w:i w:val="1"/>
+          <w:sz w:val="20"/>
+          <w:szCs w:val="20"/>
           <w:rtl w:val="0"/>
         </w:rPr>
+        <w:t xml:space="preserve">*Add rows as needed</w:t>
       </w:r>
     </w:p>
     <w:p>

</xml_diff>